<commit_message>
updates to lit review, methodologies evaluation and contribution sheet
</commit_message>
<xml_diff>
--- a/appendix/COSC3130_ContributionSheet_Group101.docx
+++ b/appendix/COSC3130_ContributionSheet_Group101.docx
@@ -452,6 +452,9 @@
             <w:pPr>
               <w:pStyle w:val="TableContents"/>
             </w:pPr>
+            <w:r>
+              <w:t>TK</w:t>
+            </w:r>
           </w:p>
         </w:tc>
       </w:tr>
@@ -549,6 +552,9 @@
             <w:pPr>
               <w:pStyle w:val="TableContents"/>
             </w:pPr>
+            <w:r>
+              <w:t>KA</w:t>
+            </w:r>
           </w:p>
         </w:tc>
       </w:tr>
@@ -651,6 +657,9 @@
             <w:pPr>
               <w:pStyle w:val="TableContents"/>
             </w:pPr>
+            <w:r>
+              <w:t>LL</w:t>
+            </w:r>
           </w:p>
         </w:tc>
       </w:tr>
@@ -748,6 +757,9 @@
             <w:pPr>
               <w:pStyle w:val="TableContents"/>
             </w:pPr>
+            <w:r>
+              <w:t>VP</w:t>
+            </w:r>
           </w:p>
         </w:tc>
       </w:tr>
@@ -850,6 +862,9 @@
             <w:pPr>
               <w:pStyle w:val="TableContents"/>
             </w:pPr>
+            <w:r>
+              <w:t>LS</w:t>
+            </w:r>
           </w:p>
         </w:tc>
       </w:tr>
@@ -935,13 +950,8 @@
         <w:t>m</w:t>
       </w:r>
       <w:r>
-        <w:t xml:space="preserve"> </w:t>
+        <w:t xml:space="preserve"> mark;</w:t>
       </w:r>
-      <w:proofErr w:type="gramStart"/>
-      <w:r>
-        <w:t>mark;</w:t>
-      </w:r>
-      <w:proofErr w:type="gramEnd"/>
     </w:p>
     <w:p>
       <w:pPr>
@@ -991,13 +1001,8 @@
         <w:t>m</w:t>
       </w:r>
       <w:r>
-        <w:t xml:space="preserve"> </w:t>
+        <w:t xml:space="preserve"> marks;</w:t>
       </w:r>
-      <w:proofErr w:type="gramStart"/>
-      <w:r>
-        <w:t>marks;</w:t>
-      </w:r>
-      <w:proofErr w:type="gramEnd"/>
     </w:p>
     <w:p>
       <w:pPr>
@@ -4270,6 +4275,15 @@
 </file>
 
 <file path=customXml/item1.xml><?xml version="1.0" encoding="utf-8"?>
+<?mso-contentType ?>
+<FormTemplates xmlns="http://schemas.microsoft.com/sharepoint/v3/contenttype/forms">
+  <Display>DocumentLibraryForm</Display>
+  <Edit>DocumentLibraryForm</Edit>
+  <New>DocumentLibraryForm</New>
+</FormTemplates>
+</file>
+
+<file path=customXml/item2.xml><?xml version="1.0" encoding="utf-8"?>
 <p:properties xmlns:p="http://schemas.microsoft.com/office/2006/metadata/properties" xmlns:xsi="http://www.w3.org/2001/XMLSchema-instance" xmlns:pc="http://schemas.microsoft.com/office/infopath/2007/PartnerControls">
   <documentManagement>
     <TaxCatchAll xmlns="85a98795-a889-4f11-826a-bcc7d5954d9d" xsi:nil="true"/>
@@ -4280,16 +4294,11 @@
 </p:properties>
 </file>
 
-<file path=customXml/item2.xml><?xml version="1.0" encoding="utf-8"?>
-<?mso-contentType ?>
-<FormTemplates xmlns="http://schemas.microsoft.com/sharepoint/v3/contenttype/forms">
-  <Display>DocumentLibraryForm</Display>
-  <Edit>DocumentLibraryForm</Edit>
-  <New>DocumentLibraryForm</New>
-</FormTemplates>
+<file path=customXml/item3.xml><?xml version="1.0" encoding="utf-8"?>
+<b:Sources xmlns:b="http://schemas.openxmlformats.org/officeDocument/2006/bibliography" xmlns="http://schemas.openxmlformats.org/officeDocument/2006/bibliography" SelectedStyle="/APASixthEditionOfficeOnline.xsl" StyleName="APA" Version="6"/>
 </file>
 
-<file path=customXml/item3.xml><?xml version="1.0" encoding="utf-8"?>
+<file path=customXml/item4.xml><?xml version="1.0" encoding="utf-8"?>
 <ct:contentTypeSchema xmlns:ct="http://schemas.microsoft.com/office/2006/metadata/contentType" xmlns:ma="http://schemas.microsoft.com/office/2006/metadata/properties/metaAttributes" ct:_="" ma:_="" ma:contentTypeName="Document" ma:contentTypeID="0x0101007548D80ECCBFD64EA96CCE858B75E71E" ma:contentTypeVersion="9" ma:contentTypeDescription="Create a new document." ma:contentTypeScope="" ma:versionID="8c0258418ab247b5c7faa5994bb40434">
   <xsd:schema xmlns:xsd="http://www.w3.org/2001/XMLSchema" xmlns:xs="http://www.w3.org/2001/XMLSchema" xmlns:p="http://schemas.microsoft.com/office/2006/metadata/properties" xmlns:ns2="4c73ef91-abdb-4224-bca0-4fbbbd8a2566" xmlns:ns3="85a98795-a889-4f11-826a-bcc7d5954d9d" targetNamespace="http://schemas.microsoft.com/office/2006/metadata/properties" ma:root="true" ma:fieldsID="f93747f59377763270b925971249636c" ns2:_="" ns3:_="">
     <xsd:import namespace="4c73ef91-abdb-4224-bca0-4fbbbd8a2566"/>
@@ -4470,11 +4479,15 @@
 </ct:contentTypeSchema>
 </file>
 
-<file path=customXml/item4.xml><?xml version="1.0" encoding="utf-8"?>
-<b:Sources xmlns:b="http://schemas.openxmlformats.org/officeDocument/2006/bibliography" xmlns="http://schemas.openxmlformats.org/officeDocument/2006/bibliography" SelectedStyle="/APASixthEditionOfficeOnline.xsl" StyleName="APA" Version="6"/>
+<file path=customXml/itemProps1.xml><?xml version="1.0" encoding="utf-8"?>
+<ds:datastoreItem xmlns:ds="http://schemas.openxmlformats.org/officeDocument/2006/customXml" ds:itemID="{05C2650A-11E4-4F02-92DE-1A4829C4D795}">
+  <ds:schemaRefs>
+    <ds:schemaRef ds:uri="http://schemas.microsoft.com/sharepoint/v3/contenttype/forms"/>
+  </ds:schemaRefs>
+</ds:datastoreItem>
 </file>
 
-<file path=customXml/itemProps1.xml><?xml version="1.0" encoding="utf-8"?>
+<file path=customXml/itemProps2.xml><?xml version="1.0" encoding="utf-8"?>
 <ds:datastoreItem xmlns:ds="http://schemas.openxmlformats.org/officeDocument/2006/customXml" ds:itemID="{673EAC44-308A-4A3D-9642-58134698D5FB}">
   <ds:schemaRefs>
     <ds:schemaRef ds:uri="http://schemas.microsoft.com/office/2006/metadata/properties"/>
@@ -4485,15 +4498,15 @@
 </ds:datastoreItem>
 </file>
 
-<file path=customXml/itemProps2.xml><?xml version="1.0" encoding="utf-8"?>
-<ds:datastoreItem xmlns:ds="http://schemas.openxmlformats.org/officeDocument/2006/customXml" ds:itemID="{05C2650A-11E4-4F02-92DE-1A4829C4D795}">
+<file path=customXml/itemProps3.xml><?xml version="1.0" encoding="utf-8"?>
+<ds:datastoreItem xmlns:ds="http://schemas.openxmlformats.org/officeDocument/2006/customXml" ds:itemID="{8D4E487C-BCDA-2B41-B3BA-7E5884923D4C}">
   <ds:schemaRefs>
-    <ds:schemaRef ds:uri="http://schemas.microsoft.com/sharepoint/v3/contenttype/forms"/>
+    <ds:schemaRef ds:uri="http://schemas.openxmlformats.org/officeDocument/2006/bibliography"/>
   </ds:schemaRefs>
 </ds:datastoreItem>
 </file>
 
-<file path=customXml/itemProps3.xml><?xml version="1.0" encoding="utf-8"?>
+<file path=customXml/itemProps4.xml><?xml version="1.0" encoding="utf-8"?>
 <ds:datastoreItem xmlns:ds="http://schemas.openxmlformats.org/officeDocument/2006/customXml" ds:itemID="{41CE6C5D-B404-4DEC-8A35-CC8E0CE70905}">
   <ds:schemaRefs>
     <ds:schemaRef ds:uri="http://schemas.microsoft.com/office/2006/metadata/contentType"/>
@@ -4512,14 +4525,6 @@
 </ds:datastoreItem>
 </file>
 
-<file path=customXml/itemProps4.xml><?xml version="1.0" encoding="utf-8"?>
-<ds:datastoreItem xmlns:ds="http://schemas.openxmlformats.org/officeDocument/2006/customXml" ds:itemID="{8D4E487C-BCDA-2B41-B3BA-7E5884923D4C}">
-  <ds:schemaRefs>
-    <ds:schemaRef ds:uri="http://schemas.openxmlformats.org/officeDocument/2006/bibliography"/>
-  </ds:schemaRefs>
-</ds:datastoreItem>
-</file>
-
 <file path=docMetadata/LabelInfo.xml><?xml version="1.0" encoding="utf-8"?>
 <clbl:labelList xmlns:clbl="http://schemas.microsoft.com/office/2020/mipLabelMetadata">
   <clbl:label id="{8c3d088b-6243-4963-a2e2-8b321ab7f8fc}" enabled="1" method="Privileged" siteId="{d1323671-cdbe-4417-b4d4-bdb24b51316b}" removed="0"/>

</xml_diff>